<commit_message>
Archive release v1.0.0 with reserved DOI
</commit_message>
<xml_diff>
--- a/docs/submission/factorized-pathway-scores-nature-communications.docx
+++ b/docs/submission/factorized-pathway-scores-nature-communications.docx
@@ -2,7 +2,7 @@
 <file path=word/document.xml><?xml version="1.0" encoding="utf-8"?>
 <w:document xmlns:w="http://schemas.openxmlformats.org/wordprocessingml/2006/main" xmlns:m="http://schemas.openxmlformats.org/officeDocument/2006/math" xmlns:r="http://schemas.openxmlformats.org/officeDocument/2006/relationships" xmlns:o="urn:schemas-microsoft-com:office:office" xmlns:v="urn:schemas-microsoft-com:vml" xmlns:w10="urn:schemas-microsoft-com:office:word" xmlns:a="http://schemas.openxmlformats.org/drawingml/2006/main" xmlns:pic="http://schemas.openxmlformats.org/drawingml/2006/picture" xmlns:wp="http://schemas.openxmlformats.org/drawingml/2006/wordprocessingDrawing">
   <w:body>
-    <w:bookmarkStart w:id="55" w:name="X401fe2adc539f084f3e3c517fa775708854a938"/>
+    <w:bookmarkStart w:id="57" w:name="X401fe2adc539f084f3e3c517fa775708854a938"/>
     <w:p>
       <w:pPr>
         <w:pStyle w:val="Heading1"/>
@@ -2262,7 +2262,7 @@
       </w:r>
     </w:p>
     <w:bookmarkEnd w:id="39"/>
-    <w:bookmarkStart w:id="40" w:name="code-availability"/>
+    <w:bookmarkStart w:id="42" w:name="code-availability"/>
     <w:p>
       <w:pPr>
         <w:pStyle w:val="Heading2"/>
@@ -2288,13 +2288,24 @@
         <w:t xml:space="preserve"> </w:t>
       </w:r>
       <w:r>
-        <w:t xml:space="preserve">repository. A permanent public repository URL, software license and archival DOI must be inserted</w:t>
-      </w:r>
-      <w:r>
-        <w:t xml:space="preserve"> </w:t>
-      </w:r>
-      <w:r>
-        <w:t xml:space="preserve">before submission. The principal output directories are</w:t>
+        <w:t xml:space="preserve">public repository at</w:t>
+      </w:r>
+      <w:r>
+        <w:t xml:space="preserve"> </w:t>
+      </w:r>
+      <w:hyperlink r:id="rId40">
+        <w:r>
+          <w:rPr>
+            <w:rStyle w:val="Hyperlink"/>
+          </w:rPr>
+          <w:t xml:space="preserve">https://github.com/Metastatebio/factorized-pathway-scores</w:t>
+        </w:r>
+      </w:hyperlink>
+      <w:r>
+        <w:t xml:space="preserve"> </w:t>
+      </w:r>
+      <w:r>
+        <w:t xml:space="preserve">(release</w:t>
       </w:r>
       <w:r>
         <w:t xml:space="preserve"> </w:t>
@@ -2303,6 +2314,50 @@
         <w:rPr>
           <w:rStyle w:val="VerbatimChar"/>
         </w:rPr>
+        <w:t xml:space="preserve">v1.0.0</w:t>
+      </w:r>
+      <w:r>
+        <w:t xml:space="preserve">) and the immutable Zenodo archive at</w:t>
+      </w:r>
+      <w:r>
+        <w:t xml:space="preserve"> </w:t>
+      </w:r>
+      <w:hyperlink r:id="rId41">
+        <w:r>
+          <w:rPr>
+            <w:rStyle w:val="Hyperlink"/>
+          </w:rPr>
+          <w:t xml:space="preserve">https://doi.org/10.5281/zenodo.22207315</w:t>
+        </w:r>
+      </w:hyperlink>
+      <w:r>
+        <w:t xml:space="preserve">. Source code is licensed under Apache-2.0; the</w:t>
+      </w:r>
+      <w:r>
+        <w:t xml:space="preserve"> </w:t>
+      </w:r>
+      <w:r>
+        <w:t xml:space="preserve">manuscript, protocols, figures and aggregate result tables are licensed under CC BY 4.0.</w:t>
+      </w:r>
+      <w:r>
+        <w:t xml:space="preserve"> </w:t>
+      </w:r>
+      <w:r>
+        <w:t xml:space="preserve">Third-party raw data are excluded and remain under their source terms. The principal output</w:t>
+      </w:r>
+      <w:r>
+        <w:t xml:space="preserve"> </w:t>
+      </w:r>
+      <w:r>
+        <w:t xml:space="preserve">directories are</w:t>
+      </w:r>
+      <w:r>
+        <w:t xml:space="preserve"> </w:t>
+      </w:r>
+      <w:r>
+        <w:rPr>
+          <w:rStyle w:val="VerbatimChar"/>
+        </w:rPr>
         <w:t xml:space="preserve">artifacts/pathway-score-st002081/</w:t>
       </w:r>
       <w:r>
@@ -2456,8 +2511,8 @@
         <w:t xml:space="preserve">.</w:t>
       </w:r>
     </w:p>
-    <w:bookmarkEnd w:id="40"/>
-    <w:bookmarkStart w:id="50" w:name="figure-legends"/>
+    <w:bookmarkEnd w:id="42"/>
+    <w:bookmarkStart w:id="52" w:name="figure-legends"/>
     <w:p>
       <w:pPr>
         <w:pStyle w:val="Heading2"/>
@@ -2517,18 +2572,18 @@
           <wp:inline>
             <wp:extent cx="5334000" cy="2582195"/>
             <wp:effectExtent b="0" l="0" r="0" t="0"/>
-            <wp:docPr descr="" title="" id="42" name="Picture"/>
+            <wp:docPr descr="" title="" id="44" name="Picture"/>
             <a:graphic>
               <a:graphicData uri="http://schemas.openxmlformats.org/drawingml/2006/picture">
                 <pic:pic>
                   <pic:nvPicPr>
-                    <pic:cNvPr descr="../../artifacts/pathway-score-publication-figures/figure-1-study-design.png" id="43" name="Picture"/>
+                    <pic:cNvPr descr="../../artifacts/pathway-score-publication-figures/figure-1-study-design.png" id="45" name="Picture"/>
                     <pic:cNvPicPr>
                       <a:picLocks noChangeArrowheads="1" noChangeAspect="1"/>
                     </pic:cNvPicPr>
                   </pic:nvPicPr>
                   <pic:blipFill>
-                    <a:blip r:embed="rId41"/>
+                    <a:blip r:embed="rId43"/>
                     <a:stretch>
                       <a:fillRect/>
                     </a:stretch>
@@ -2676,18 +2731,18 @@
           <wp:inline>
             <wp:extent cx="5334000" cy="3687881"/>
             <wp:effectExtent b="0" l="0" r="0" t="0"/>
-            <wp:docPr descr="" title="" id="45" name="Picture"/>
+            <wp:docPr descr="" title="" id="47" name="Picture"/>
             <a:graphic>
               <a:graphicData uri="http://schemas.openxmlformats.org/drawingml/2006/picture">
                 <pic:pic>
                   <pic:nvPicPr>
-                    <pic:cNvPr descr="../../artifacts/pathway-score-publication-figures/figure-2-human-validation.png" id="46" name="Picture"/>
+                    <pic:cNvPr descr="../../artifacts/pathway-score-publication-figures/figure-2-human-validation.png" id="48" name="Picture"/>
                     <pic:cNvPicPr>
                       <a:picLocks noChangeArrowheads="1" noChangeAspect="1"/>
                     </pic:cNvPicPr>
                   </pic:nvPicPr>
                   <pic:blipFill>
-                    <a:blip r:embed="rId44"/>
+                    <a:blip r:embed="rId46"/>
                     <a:stretch>
                       <a:fillRect/>
                     </a:stretch>
@@ -2873,18 +2928,18 @@
           <wp:inline>
             <wp:extent cx="5334000" cy="2825917"/>
             <wp:effectExtent b="0" l="0" r="0" t="0"/>
-            <wp:docPr descr="" title="" id="48" name="Picture"/>
+            <wp:docPr descr="" title="" id="50" name="Picture"/>
             <a:graphic>
               <a:graphicData uri="http://schemas.openxmlformats.org/drawingml/2006/picture">
                 <pic:pic>
                   <pic:nvPicPr>
-                    <pic:cNvPr descr="../../artifacts/pathway-score-publication-figures/figure-3-ccle-validation.png" id="49" name="Picture"/>
+                    <pic:cNvPr descr="../../artifacts/pathway-score-publication-figures/figure-3-ccle-validation.png" id="51" name="Picture"/>
                     <pic:cNvPicPr>
                       <a:picLocks noChangeArrowheads="1" noChangeAspect="1"/>
                     </pic:cNvPicPr>
                   </pic:nvPicPr>
                   <pic:blipFill>
-                    <a:blip r:embed="rId47"/>
+                    <a:blip r:embed="rId49"/>
                     <a:stretch>
                       <a:fillRect/>
                     </a:stretch>
@@ -2911,8 +2966,8 @@
         </w:drawing>
       </w:r>
     </w:p>
-    <w:bookmarkEnd w:id="50"/>
-    <w:bookmarkStart w:id="51" w:name="references"/>
+    <w:bookmarkEnd w:id="52"/>
+    <w:bookmarkStart w:id="53" w:name="references"/>
     <w:p>
       <w:pPr>
         <w:pStyle w:val="Heading2"/>
@@ -3869,8 +3924,8 @@
         <w:t xml:space="preserve">, 7 (2013).</w:t>
       </w:r>
     </w:p>
-    <w:bookmarkEnd w:id="51"/>
-    <w:bookmarkStart w:id="52" w:name="acknowledgements"/>
+    <w:bookmarkEnd w:id="53"/>
+    <w:bookmarkStart w:id="54" w:name="acknowledgements"/>
     <w:p>
       <w:pPr>
         <w:pStyle w:val="Heading2"/>
@@ -3893,8 +3948,8 @@
         <w:t xml:space="preserve">Inc.</w:t>
       </w:r>
     </w:p>
-    <w:bookmarkEnd w:id="52"/>
-    <w:bookmarkStart w:id="53" w:name="author-contributions"/>
+    <w:bookmarkEnd w:id="54"/>
+    <w:bookmarkStart w:id="55" w:name="author-contributions"/>
     <w:p>
       <w:pPr>
         <w:pStyle w:val="Heading2"/>
@@ -3935,8 +3990,8 @@
         <w:t xml:space="preserve">review &amp; editing.</w:t>
       </w:r>
     </w:p>
-    <w:bookmarkEnd w:id="53"/>
-    <w:bookmarkStart w:id="54" w:name="competing-interests"/>
+    <w:bookmarkEnd w:id="55"/>
+    <w:bookmarkStart w:id="56" w:name="competing-interests"/>
     <w:p>
       <w:pPr>
         <w:pStyle w:val="Heading2"/>
@@ -3965,8 +4020,8 @@
         <w:t xml:space="preserve">the publication of this work. The author declares no other competing interests.</w:t>
       </w:r>
     </w:p>
-    <w:bookmarkEnd w:id="54"/>
-    <w:bookmarkEnd w:id="55"/>
+    <w:bookmarkEnd w:id="56"/>
+    <w:bookmarkEnd w:id="57"/>
     <w:sectPr/>
   </w:body>
 </w:document>

</xml_diff>